<commit_message>
update diagram: larger fonts and improved layout
Agent-Logs-Url: https://github.com/leng-peng/new-jet/sessions/85cc1405-402b-4b83-a407-d3dfbf488b22

Co-authored-by: leng-peng <252009236+leng-peng@users.noreply.github.com>
</commit_message>
<xml_diff>
--- a/空海平台多节点信号级高效相参合成机理模型_功能介绍.docx
+++ b/空海平台多节点信号级高效相参合成机理模型_功能介绍.docx
@@ -112,13 +112,13 @@
     </w:p>
     <w:p>
       <w:pPr>
-        <w:spacing w:before="80" w:after="40"/>
+        <w:spacing w:before="120" w:after="80"/>
         <w:jc w:val="center"/>
       </w:pPr>
       <w:r>
         <w:drawing>
           <wp:inline xmlns:a="http://schemas.openxmlformats.org/drawingml/2006/main" xmlns:pic="http://schemas.openxmlformats.org/drawingml/2006/picture">
-            <wp:extent cx="5760000" cy="3449849"/>
+            <wp:extent cx="6300000" cy="4520561"/>
             <wp:docPr id="1" name="Picture 1"/>
             <wp:cNvGraphicFramePr>
               <a:graphicFrameLocks noChangeAspect="1"/>
@@ -127,11 +127,11 @@
               <a:graphicData uri="http://schemas.openxmlformats.org/drawingml/2006/picture">
                 <pic:pic>
                   <pic:nvPicPr>
-                    <pic:cNvPr id="0" name="model_diagram.png"/>
+                    <pic:cNvPr id="0" name="model_diagram_v2.png"/>
                     <pic:cNvPicPr/>
                   </pic:nvPicPr>
                   <pic:blipFill>
-                    <a:blip r:embed="rId9"/>
+                    <a:blip r:embed="rId10"/>
                     <a:stretch>
                       <a:fillRect/>
                     </a:stretch>
@@ -139,7 +139,7 @@
                   <pic:spPr>
                     <a:xfrm>
                       <a:off x="0" y="0"/>
-                      <a:ext cx="5760000" cy="3449849"/>
+                      <a:ext cx="6300000" cy="4520561"/>
                     </a:xfrm>
                     <a:prstGeom prst="rect"/>
                   </pic:spPr>

</xml_diff>

<commit_message>
v5 diagram: large 18-22pt fonts, two-column layout, 14pt effective in Word
Agent-Logs-Url: https://github.com/leng-peng/new-jet/sessions/0ea3579f-00cb-4635-b01a-2b1fffdca4fc

Co-authored-by: leng-peng <252009236+leng-peng@users.noreply.github.com>
</commit_message>
<xml_diff>
--- a/空海平台多节点信号级高效相参合成机理模型_功能介绍.docx
+++ b/空海平台多节点信号级高效相参合成机理模型_功能介绍.docx
@@ -118,7 +118,7 @@
       <w:r>
         <w:drawing>
           <wp:inline xmlns:a="http://schemas.openxmlformats.org/drawingml/2006/main" xmlns:pic="http://schemas.openxmlformats.org/drawingml/2006/picture">
-            <wp:extent cx="6300000" cy="4520561"/>
+            <wp:extent cx="6300000" cy="27456931"/>
             <wp:docPr id="1" name="Picture 1"/>
             <wp:cNvGraphicFramePr>
               <a:graphicFrameLocks noChangeAspect="1"/>
@@ -127,11 +127,11 @@
               <a:graphicData uri="http://schemas.openxmlformats.org/drawingml/2006/picture">
                 <pic:pic>
                   <pic:nvPicPr>
-                    <pic:cNvPr id="0" name="model_diagram_v2.png"/>
+                    <pic:cNvPr id="0" name="model_diagram_v5.png"/>
                     <pic:cNvPicPr/>
                   </pic:nvPicPr>
                   <pic:blipFill>
-                    <a:blip r:embed="rId10"/>
+                    <a:blip r:embed="rId11"/>
                     <a:stretch>
                       <a:fillRect/>
                     </a:stretch>
@@ -139,7 +139,7 @@
                   <pic:spPr>
                     <a:xfrm>
                       <a:off x="0" y="0"/>
-                      <a:ext cx="6300000" cy="4520561"/>
+                      <a:ext cx="6300000" cy="27456931"/>
                     </a:xfrm>
                     <a:prstGeom prst="rect"/>
                   </pic:spPr>

</xml_diff>